<commit_message>
Informe de Fase 1 actualizado para la presentación al cliente
Es la primera vez que se presenta — los comentarios de Ignacio llegaron
antes de esta entrega, no después, así que el informe incorpora todo lo que
hay hoy, no sólo el corte original de R1:

- Colores a medida sumado a "Qué se puede hacer hoy" (Cargar un pedido).
- Nueva sección "Cómo lo validamos": una línea sobre la revisión completa
  por rol y en mobile antes de mostrarlo, sin exponer el detalle interno de
  qué se encontró y corrigió.
- "Qué queda pendiente" se achica (la pregunta de carga directa ya se sacó
  en el documento de definiciones).
- "Próxima etapa" ahora dice Stock y Producción juntos, reflejando la
  decisión de fusionar R2+R3, y aclara que las mejoras que llegaron ya están
  incorporadas al alcance.

Co-Authored-By: Claude Sonnet 5 <noreply@anthropic.com>
</commit_message>
<xml_diff>
--- a/docs/entregables/NEXA - Informe de avance R1.docx
+++ b/docs/entregables/NEXA - Informe de avance R1.docx
@@ -10,7 +10,7 @@
         <w:rPr>
           <w:color w:val="1A1A1A"/>
         </w:rPr>
-        <w:t>NEXA — Informe de avance</w:t>
+        <w:t>NEXA — Informe de Fase 1</w:t>
       </w:r>
     </w:p>
     <w:p>
@@ -18,7 +18,7 @@
         <w:rPr>
           <w:b/>
         </w:rPr>
-        <w:t>Primera entrega: Núcleo + Pedidos</w:t>
+        <w:t>Núcleo + Pedidos</w:t>
       </w:r>
       <w:r>
         <w:t xml:space="preserve"> · Septiembre 2026</w:t>
@@ -338,6 +338,17 @@
       </w:r>
     </w:p>
     <w:p>
+      <w:r>
+        <w:rPr>
+          <w:b/>
+        </w:rPr>
+        <w:t>Colores a medida.</w:t>
+      </w:r>
+      <w:r>
+        <w:t xml:space="preserve"> Cuando el pedido es de un color especial que no está en el catálogo, ahora se puede dar de alta ahí mismo — se le asigna código automáticamente, con la misma regla que usa todo el catálogo — en vez de dejarlo pendiente para cargar después a mano.</w:t>
+      </w:r>
+    </w:p>
+    <w:p>
       <w:pPr>
         <w:pStyle w:val="Heading2"/>
       </w:pPr>
@@ -437,21 +448,12 @@
         <w:rPr>
           <w:color w:val="1A1A1A"/>
         </w:rPr>
-        <w:t>Qué queda pendiente de esta etapa</w:t>
+        <w:t>Cómo lo validamos</w:t>
       </w:r>
     </w:p>
     <w:p>
       <w:r>
-        <w:t xml:space="preserve">Nada bloquea el uso de lo que ya está. Lo que sigue mejorando semana a semana, sin que haya que esperar, son las </w:t>
-      </w:r>
-      <w:r>
-        <w:rPr>
-          <w:b/>
-        </w:rPr>
-        <w:t>definiciones que quedaron pendientes de la reunión</w:t>
-      </w:r>
-      <w:r>
-        <w:t xml:space="preserve"> (documento aparte, "NEXA — Definiciones pendientes"): la lista oficial de colores, si van a cargar el pedido acá directamente o van a seguir con el Excel, y sobre todo los mínimos y máximos reales de cada producto — hoy el semáforo de stock está calibrado con los valores del Excel viejo, y por eso casi todo aparece en rojo.</w:t>
+        <w:t>Antes de esta entrega recorrimos el sistema completo con cada uno de los cuatro roles, pantalla por pantalla: quién ve qué, quién puede cargar qué, y qué pasa cuando algo sale mal (un pedido que no existe, un cliente repetido, un pedido sin ítems). También lo probamos en celular, no sólo en computadora, porque va a haber gente en planta usándolo así. Lo que encontramos en el camino se corrigió antes de que ustedes lo vieran.</w:t>
       </w:r>
     </w:p>
     <w:p>
@@ -462,12 +464,46 @@
         <w:rPr>
           <w:color w:val="1A1A1A"/>
         </w:rPr>
-        <w:t>Próxima entrega</w:t>
+        <w:t>Qué queda pendiente</w:t>
       </w:r>
     </w:p>
     <w:p>
       <w:r>
-        <w:t>La segunda etapa (Stock) agrega el registro de entradas y salidas con historial, y separa claramente cuánto hay disponible, cuánto está comprometido en pedidos abiertos y cuánto falta producir — hoy eso se ve sólo pedido por pedido, ahí se va a poder ver de conjunto.</w:t>
+        <w:t xml:space="preserve">Nada de esto bloquea el uso de lo que ya está. Lo que sigue abierto son las </w:t>
+      </w:r>
+      <w:r>
+        <w:rPr>
+          <w:b/>
+        </w:rPr>
+        <w:t>definiciones que quedaron pendientes de la reunión</w:t>
+      </w:r>
+      <w:r>
+        <w:t xml:space="preserve"> (documento aparte, "NEXA — Definiciones pendientes"): la lista oficial de colores y, sobre todo, los mínimos y máximos reales de cada producto — hoy el semáforo de stock está calibrado con los valores del Excel viejo, y por eso casi todo aparece en rojo.</w:t>
+      </w:r>
+    </w:p>
+    <w:p>
+      <w:pPr>
+        <w:pStyle w:val="Heading1"/>
+      </w:pPr>
+      <w:r>
+        <w:rPr>
+          <w:color w:val="1A1A1A"/>
+        </w:rPr>
+        <w:t>Próxima etapa</w:t>
+      </w:r>
+    </w:p>
+    <w:p>
+      <w:r>
+        <w:t xml:space="preserve">Vamos a seguir directamente con </w:t>
+      </w:r>
+      <w:r>
+        <w:rPr>
+          <w:b/>
+        </w:rPr>
+        <w:t>Stock y Producción juntos</w:t>
+      </w:r>
+      <w:r>
+        <w:t>: el registro de entradas y salidas con historial, cuánto hay disponible versus comprometido versus a producir, y el circuito completo de la inyectora — desde la cola de producción priorizada hasta la partida y la caja etiquetada. Las mejoras que nos hicieron llegar sobre este circuito ya están incorporadas al alcance.</w:t>
       </w:r>
     </w:p>
     <w:sectPr>

</xml_diff>